<commit_message>
docs: update duration to 8 weeks, enrich self-evaluation & feedback content, format evaluation criteria as structured markdown table
</commit_message>
<xml_diff>
--- a/BaoCao_ThucTap_NgoaiTruong_AWS_SageMaker_MLOps.docx
+++ b/BaoCao_ThucTap_NgoaiTruong_AWS_SageMaker_MLOps.docx
@@ -754,7 +754,7 @@
           <w:color w:val="003366"/>
           <w:sz w:val="24"/>
         </w:rPr>
-        <w:t>PHẦN 5: TỰ ĐÁNH GIÁ VÀ PHẢN HỒI THỰC TẬP</w:t>
+        <w:t>PHẦN 5: TỰ ĐÁNH GIÁ VÀ PHẢN HỒI THỰC TẬP (8 TUẦN)</w:t>
       </w:r>
     </w:p>
     <w:p>
@@ -766,7 +766,7 @@
           <w:rFonts w:ascii="Times New Roman" w:hAnsi="Times New Roman"/>
           <w:sz w:val="24"/>
         </w:rPr>
-        <w:t xml:space="preserve">  5.1. Đánh giá Tổng quan (Overall Evaluation)</w:t>
+        <w:t xml:space="preserve">  5.1. Bảng Tiêu chí Đánh giá Cá nhân</w:t>
       </w:r>
     </w:p>
     <w:p>
@@ -778,7 +778,7 @@
           <w:rFonts w:ascii="Times New Roman" w:hAnsi="Times New Roman"/>
           <w:sz w:val="24"/>
         </w:rPr>
-        <w:t xml:space="preserve">  5.2. Câu hỏi Bổ sung (Additional Questions)</w:t>
+        <w:t xml:space="preserve">  5.2. Đánh giá Tổng quan &amp; Phản hồi Thực tập</w:t>
       </w:r>
     </w:p>
     <w:p>
@@ -790,7 +790,7 @@
           <w:rFonts w:ascii="Times New Roman" w:hAnsi="Times New Roman"/>
           <w:sz w:val="24"/>
         </w:rPr>
-        <w:t xml:space="preserve">  5.3. Đề xuất &amp; Kỳ vọng (Suggestions &amp; Expectations)</w:t>
+        <w:t xml:space="preserve">  5.3. Đề xuất &amp; Bài học Kinh nghiệm</w:t>
       </w:r>
     </w:p>
     <w:p>
@@ -2536,7 +2536,7 @@
           <w:color w:val="003366"/>
           <w:sz w:val="30"/>
         </w:rPr>
-        <w:t>PHẦN 5: TỰ ĐÁNH GIÁ VÀ PHẢN HỒI THỰC TẬP</w:t>
+        <w:t>PHẦN 5: TỰ ĐÁNH GIÁ VÀ PHẢN HỒI THỰC TẬP (8 TUẦN)</w:t>
       </w:r>
     </w:p>
     <w:p>
@@ -2551,7 +2551,767 @@
           <w:color w:val="006699"/>
           <w:sz w:val="27"/>
         </w:rPr>
-        <w:t>5.1. Đánh giá Tổng quan (Overall Evaluation)</w:t>
+        <w:t>5.1. Bảng Tiêu chí Đánh giá Cá nhân (Evaluation Criteria Table)</w:t>
+      </w:r>
+    </w:p>
+    <w:p>
+      <w:pPr>
+        <w:spacing w:before="0" w:after="80" w:line="300" w:lineRule="auto"/>
+        <w:jc w:val="left"/>
+      </w:pPr>
+      <w:r>
+        <w:rPr>
+          <w:rFonts w:ascii="Times New Roman" w:hAnsi="Times New Roman"/>
+          <w:b w:val="0"/>
+          <w:i w:val="0"/>
+          <w:sz w:val="26"/>
+        </w:rPr>
+        <w:t>Dưới đây là bảng đánh giá 8 tiêu chí chuyên môn dựa trên các kết quả thực tế đạt được trong 8 tuần thực tập:</w:t>
+      </w:r>
+    </w:p>
+    <w:tbl>
+      <w:tblPr>
+        <w:tblW w:type="auto" w:w="0"/>
+        <w:jc w:val="center"/>
+        <w:tblLayout w:type="fixed"/>
+        <w:tblLook w:firstColumn="1" w:firstRow="1" w:lastColumn="0" w:lastRow="0" w:noHBand="0" w:noVBand="1" w:val="04A0"/>
+      </w:tblPr>
+      <w:tblGrid>
+        <w:gridCol w:w="2351"/>
+        <w:gridCol w:w="2351"/>
+        <w:gridCol w:w="2351"/>
+        <w:gridCol w:w="2351"/>
+      </w:tblGrid>
+      <w:tr>
+        <w:tc>
+          <w:tcPr>
+            <w:tcW w:type="dxa" w:w="576"/>
+            <w:shd w:fill="003366"/>
+          </w:tcPr>
+          <w:p>
+            <w:pPr>
+              <w:spacing w:before="80" w:after="80"/>
+              <w:jc w:val="center"/>
+            </w:pPr>
+            <w:r>
+              <w:rPr>
+                <w:rFonts w:ascii="Times New Roman" w:hAnsi="Times New Roman"/>
+                <w:b/>
+                <w:color w:val="FFFFFF"/>
+                <w:sz w:val="22"/>
+              </w:rPr>
+              <w:t>#</w:t>
+            </w:r>
+          </w:p>
+        </w:tc>
+        <w:tc>
+          <w:tcPr>
+            <w:tcW w:type="dxa" w:w="3168"/>
+            <w:shd w:fill="003366"/>
+          </w:tcPr>
+          <w:p>
+            <w:pPr>
+              <w:spacing w:before="80" w:after="80"/>
+              <w:jc w:val="center"/>
+            </w:pPr>
+            <w:r>
+              <w:rPr>
+                <w:rFonts w:ascii="Times New Roman" w:hAnsi="Times New Roman"/>
+                <w:b/>
+                <w:color w:val="FFFFFF"/>
+                <w:sz w:val="22"/>
+              </w:rPr>
+              <w:t>Tiêu chí Đánh giá</w:t>
+            </w:r>
+          </w:p>
+        </w:tc>
+        <w:tc>
+          <w:tcPr>
+            <w:tcW w:type="dxa" w:w="1584"/>
+            <w:shd w:fill="003366"/>
+          </w:tcPr>
+          <w:p>
+            <w:pPr>
+              <w:spacing w:before="80" w:after="80"/>
+              <w:jc w:val="center"/>
+            </w:pPr>
+            <w:r>
+              <w:rPr>
+                <w:rFonts w:ascii="Times New Roman" w:hAnsi="Times New Roman"/>
+                <w:b/>
+                <w:color w:val="FFFFFF"/>
+                <w:sz w:val="22"/>
+              </w:rPr>
+              <w:t>Đánh giá</w:t>
+            </w:r>
+          </w:p>
+        </w:tc>
+        <w:tc>
+          <w:tcPr>
+            <w:tcW w:type="dxa" w:w="4608"/>
+            <w:shd w:fill="003366"/>
+          </w:tcPr>
+          <w:p>
+            <w:pPr>
+              <w:spacing w:before="80" w:after="80"/>
+              <w:jc w:val="center"/>
+            </w:pPr>
+            <w:r>
+              <w:rPr>
+                <w:rFonts w:ascii="Times New Roman" w:hAnsi="Times New Roman"/>
+                <w:b/>
+                <w:color w:val="FFFFFF"/>
+                <w:sz w:val="22"/>
+              </w:rPr>
+              <w:t>Mô tả Chi tiết &amp; Minh chứng Thực tế</w:t>
+            </w:r>
+          </w:p>
+        </w:tc>
+      </w:tr>
+      <w:tr>
+        <w:tc>
+          <w:tcPr>
+            <w:tcW w:type="dxa" w:w="576"/>
+            <w:shd w:fill="FFFFFF"/>
+          </w:tcPr>
+          <w:p>
+            <w:pPr>
+              <w:spacing w:before="60" w:after="60"/>
+              <w:jc w:val="center"/>
+            </w:pPr>
+            <w:r>
+              <w:rPr>
+                <w:rFonts w:ascii="Times New Roman" w:hAnsi="Times New Roman"/>
+                <w:b/>
+                <w:sz w:val="21"/>
+              </w:rPr>
+              <w:t>1</w:t>
+            </w:r>
+          </w:p>
+        </w:tc>
+        <w:tc>
+          <w:tcPr>
+            <w:tcW w:type="dxa" w:w="3168"/>
+            <w:shd w:fill="FFFFFF"/>
+          </w:tcPr>
+          <w:p>
+            <w:pPr>
+              <w:spacing w:before="60" w:after="60"/>
+            </w:pPr>
+            <w:r>
+              <w:rPr>
+                <w:rFonts w:ascii="Times New Roman" w:hAnsi="Times New Roman"/>
+                <w:sz w:val="21"/>
+              </w:rPr>
+              <w:t>Kiến thức AWS Kỹ thuật</w:t>
+            </w:r>
+          </w:p>
+        </w:tc>
+        <w:tc>
+          <w:tcPr>
+            <w:tcW w:type="dxa" w:w="1584"/>
+            <w:shd w:fill="FFFFFF"/>
+          </w:tcPr>
+          <w:p>
+            <w:pPr>
+              <w:spacing w:before="60" w:after="60"/>
+              <w:jc w:val="center"/>
+            </w:pPr>
+            <w:r>
+              <w:rPr>
+                <w:rFonts w:ascii="Times New Roman" w:hAnsi="Times New Roman"/>
+                <w:b/>
+                <w:sz w:val="21"/>
+              </w:rPr>
+              <w:t>Tốt</w:t>
+            </w:r>
+          </w:p>
+        </w:tc>
+        <w:tc>
+          <w:tcPr>
+            <w:tcW w:type="dxa" w:w="4608"/>
+            <w:shd w:fill="FFFFFF"/>
+          </w:tcPr>
+          <w:p>
+            <w:pPr>
+              <w:spacing w:before="60" w:after="60"/>
+            </w:pPr>
+            <w:r>
+              <w:rPr>
+                <w:rFonts w:ascii="Times New Roman" w:hAnsi="Times New Roman"/>
+                <w:sz w:val="21"/>
+              </w:rPr>
+              <w:t>Thành thạo S3, IAM, SageMaker Endpoints/Experiments/Pipelines, Lambda, API Gateway, CloudWatch.</w:t>
+            </w:r>
+          </w:p>
+        </w:tc>
+      </w:tr>
+      <w:tr>
+        <w:tc>
+          <w:tcPr>
+            <w:tcW w:type="dxa" w:w="576"/>
+            <w:shd w:fill="F2F5F8"/>
+          </w:tcPr>
+          <w:p>
+            <w:pPr>
+              <w:spacing w:before="60" w:after="60"/>
+              <w:jc w:val="center"/>
+            </w:pPr>
+            <w:r>
+              <w:rPr>
+                <w:rFonts w:ascii="Times New Roman" w:hAnsi="Times New Roman"/>
+                <w:b/>
+                <w:sz w:val="21"/>
+              </w:rPr>
+              <w:t>2</w:t>
+            </w:r>
+          </w:p>
+        </w:tc>
+        <w:tc>
+          <w:tcPr>
+            <w:tcW w:type="dxa" w:w="3168"/>
+            <w:shd w:fill="F2F5F8"/>
+          </w:tcPr>
+          <w:p>
+            <w:pPr>
+              <w:spacing w:before="60" w:after="60"/>
+            </w:pPr>
+            <w:r>
+              <w:rPr>
+                <w:rFonts w:ascii="Times New Roman" w:hAnsi="Times New Roman"/>
+                <w:sz w:val="21"/>
+              </w:rPr>
+              <w:t>Kỹ năng Machine Learning</w:t>
+            </w:r>
+          </w:p>
+        </w:tc>
+        <w:tc>
+          <w:tcPr>
+            <w:tcW w:type="dxa" w:w="1584"/>
+            <w:shd w:fill="F2F5F8"/>
+          </w:tcPr>
+          <w:p>
+            <w:pPr>
+              <w:spacing w:before="60" w:after="60"/>
+              <w:jc w:val="center"/>
+            </w:pPr>
+            <w:r>
+              <w:rPr>
+                <w:rFonts w:ascii="Times New Roman" w:hAnsi="Times New Roman"/>
+                <w:b/>
+                <w:sz w:val="21"/>
+              </w:rPr>
+              <w:t>Tốt</w:t>
+            </w:r>
+          </w:p>
+        </w:tc>
+        <w:tc>
+          <w:tcPr>
+            <w:tcW w:type="dxa" w:w="4608"/>
+            <w:shd w:fill="F2F5F8"/>
+          </w:tcPr>
+          <w:p>
+            <w:pPr>
+              <w:spacing w:before="60" w:after="60"/>
+            </w:pPr>
+            <w:r>
+              <w:rPr>
+                <w:rFonts w:ascii="Times New Roman" w:hAnsi="Times New Roman"/>
+                <w:sz w:val="21"/>
+              </w:rPr>
+              <w:t>Trích xuất 22 đặc trưng chuỗi thời gian; train XGBoost đạt Test RMSE 925.28 và MAPE 9.92%.</w:t>
+            </w:r>
+          </w:p>
+        </w:tc>
+      </w:tr>
+      <w:tr>
+        <w:tc>
+          <w:tcPr>
+            <w:tcW w:type="dxa" w:w="576"/>
+            <w:shd w:fill="FFFFFF"/>
+          </w:tcPr>
+          <w:p>
+            <w:pPr>
+              <w:spacing w:before="60" w:after="60"/>
+              <w:jc w:val="center"/>
+            </w:pPr>
+            <w:r>
+              <w:rPr>
+                <w:rFonts w:ascii="Times New Roman" w:hAnsi="Times New Roman"/>
+                <w:b/>
+                <w:sz w:val="21"/>
+              </w:rPr>
+              <w:t>3</w:t>
+            </w:r>
+          </w:p>
+        </w:tc>
+        <w:tc>
+          <w:tcPr>
+            <w:tcW w:type="dxa" w:w="3168"/>
+            <w:shd w:fill="FFFFFF"/>
+          </w:tcPr>
+          <w:p>
+            <w:pPr>
+              <w:spacing w:before="60" w:after="60"/>
+            </w:pPr>
+            <w:r>
+              <w:rPr>
+                <w:rFonts w:ascii="Times New Roman" w:hAnsi="Times New Roman"/>
+                <w:sz w:val="21"/>
+              </w:rPr>
+              <w:t>Giải quyết Vấn đề &amp; Debug</w:t>
+            </w:r>
+          </w:p>
+        </w:tc>
+        <w:tc>
+          <w:tcPr>
+            <w:tcW w:type="dxa" w:w="1584"/>
+            <w:shd w:fill="FFFFFF"/>
+          </w:tcPr>
+          <w:p>
+            <w:pPr>
+              <w:spacing w:before="60" w:after="60"/>
+              <w:jc w:val="center"/>
+            </w:pPr>
+            <w:r>
+              <w:rPr>
+                <w:rFonts w:ascii="Times New Roman" w:hAnsi="Times New Roman"/>
+                <w:b/>
+                <w:sz w:val="21"/>
+              </w:rPr>
+              <w:t>Tốt</w:t>
+            </w:r>
+          </w:p>
+        </w:tc>
+        <w:tc>
+          <w:tcPr>
+            <w:tcW w:type="dxa" w:w="4608"/>
+            <w:shd w:fill="FFFFFF"/>
+          </w:tcPr>
+          <w:p>
+            <w:pPr>
+              <w:spacing w:before="60" w:after="60"/>
+            </w:pPr>
+            <w:r>
+              <w:rPr>
+                <w:rFonts w:ascii="Times New Roman" w:hAnsi="Times New Roman"/>
+                <w:sz w:val="21"/>
+              </w:rPr>
+              <w:t>Xử lý triệt để 3 sự cố: Nâng Service Quotas, ấn định version SDK `sagemaker==2.257.5`, sửa tràn số log `np.expm1()`.</w:t>
+            </w:r>
+          </w:p>
+        </w:tc>
+      </w:tr>
+      <w:tr>
+        <w:tc>
+          <w:tcPr>
+            <w:tcW w:type="dxa" w:w="576"/>
+            <w:shd w:fill="F2F5F8"/>
+          </w:tcPr>
+          <w:p>
+            <w:pPr>
+              <w:spacing w:before="60" w:after="60"/>
+              <w:jc w:val="center"/>
+            </w:pPr>
+            <w:r>
+              <w:rPr>
+                <w:rFonts w:ascii="Times New Roman" w:hAnsi="Times New Roman"/>
+                <w:b/>
+                <w:sz w:val="21"/>
+              </w:rPr>
+              <w:t>4</w:t>
+            </w:r>
+          </w:p>
+        </w:tc>
+        <w:tc>
+          <w:tcPr>
+            <w:tcW w:type="dxa" w:w="3168"/>
+            <w:shd w:fill="F2F5F8"/>
+          </w:tcPr>
+          <w:p>
+            <w:pPr>
+              <w:spacing w:before="60" w:after="60"/>
+            </w:pPr>
+            <w:r>
+              <w:rPr>
+                <w:rFonts w:ascii="Times New Roman" w:hAnsi="Times New Roman"/>
+                <w:sz w:val="21"/>
+              </w:rPr>
+              <w:t>Chất lượng Code &amp; Kiến trúc</w:t>
+            </w:r>
+          </w:p>
+        </w:tc>
+        <w:tc>
+          <w:tcPr>
+            <w:tcW w:type="dxa" w:w="1584"/>
+            <w:shd w:fill="F2F5F8"/>
+          </w:tcPr>
+          <w:p>
+            <w:pPr>
+              <w:spacing w:before="60" w:after="60"/>
+              <w:jc w:val="center"/>
+            </w:pPr>
+            <w:r>
+              <w:rPr>
+                <w:rFonts w:ascii="Times New Roman" w:hAnsi="Times New Roman"/>
+                <w:b/>
+                <w:sz w:val="21"/>
+              </w:rPr>
+              <w:t>Khá</w:t>
+            </w:r>
+          </w:p>
+        </w:tc>
+        <w:tc>
+          <w:tcPr>
+            <w:tcW w:type="dxa" w:w="4608"/>
+            <w:shd w:fill="F2F5F8"/>
+          </w:tcPr>
+          <w:p>
+            <w:pPr>
+              <w:spacing w:before="60" w:after="60"/>
+            </w:pPr>
+            <w:r>
+              <w:rPr>
+                <w:rFonts w:ascii="Times New Roman" w:hAnsi="Times New Roman"/>
+                <w:sz w:val="21"/>
+              </w:rPr>
+              <w:t>Mã nguồn tổ chức mô-đun hóa sạch sẽ; đóng gói tự động `sourcedir.tar.gz`.</w:t>
+            </w:r>
+          </w:p>
+        </w:tc>
+      </w:tr>
+      <w:tr>
+        <w:tc>
+          <w:tcPr>
+            <w:tcW w:type="dxa" w:w="576"/>
+            <w:shd w:fill="FFFFFF"/>
+          </w:tcPr>
+          <w:p>
+            <w:pPr>
+              <w:spacing w:before="60" w:after="60"/>
+              <w:jc w:val="center"/>
+            </w:pPr>
+            <w:r>
+              <w:rPr>
+                <w:rFonts w:ascii="Times New Roman" w:hAnsi="Times New Roman"/>
+                <w:b/>
+                <w:sz w:val="21"/>
+              </w:rPr>
+              <w:t>5</w:t>
+            </w:r>
+          </w:p>
+        </w:tc>
+        <w:tc>
+          <w:tcPr>
+            <w:tcW w:type="dxa" w:w="3168"/>
+            <w:shd w:fill="FFFFFF"/>
+          </w:tcPr>
+          <w:p>
+            <w:pPr>
+              <w:spacing w:before="60" w:after="60"/>
+            </w:pPr>
+            <w:r>
+              <w:rPr>
+                <w:rFonts w:ascii="Times New Roman" w:hAnsi="Times New Roman"/>
+                <w:sz w:val="21"/>
+              </w:rPr>
+              <w:t>Làm việc Nhóm &amp; Hợp tác</w:t>
+            </w:r>
+          </w:p>
+        </w:tc>
+        <w:tc>
+          <w:tcPr>
+            <w:tcW w:type="dxa" w:w="1584"/>
+            <w:shd w:fill="FFFFFF"/>
+          </w:tcPr>
+          <w:p>
+            <w:pPr>
+              <w:spacing w:before="60" w:after="60"/>
+              <w:jc w:val="center"/>
+            </w:pPr>
+            <w:r>
+              <w:rPr>
+                <w:rFonts w:ascii="Times New Roman" w:hAnsi="Times New Roman"/>
+                <w:b/>
+                <w:sz w:val="21"/>
+              </w:rPr>
+              <w:t>Tốt</w:t>
+            </w:r>
+          </w:p>
+        </w:tc>
+        <w:tc>
+          <w:tcPr>
+            <w:tcW w:type="dxa" w:w="4608"/>
+            <w:shd w:fill="FFFFFF"/>
+          </w:tcPr>
+          <w:p>
+            <w:pPr>
+              <w:spacing w:before="60" w:after="60"/>
+            </w:pPr>
+            <w:r>
+              <w:rPr>
+                <w:rFonts w:ascii="Times New Roman" w:hAnsi="Times New Roman"/>
+                <w:sz w:val="21"/>
+              </w:rPr>
+              <w:t>Phân công nhịp nhàng 3 vai trò (Data/ML, Backend, Infra); giao tiếp minh bạch và họp trao đổi định kỳ.</w:t>
+            </w:r>
+          </w:p>
+        </w:tc>
+      </w:tr>
+      <w:tr>
+        <w:tc>
+          <w:tcPr>
+            <w:tcW w:type="dxa" w:w="576"/>
+            <w:shd w:fill="F2F5F8"/>
+          </w:tcPr>
+          <w:p>
+            <w:pPr>
+              <w:spacing w:before="60" w:after="60"/>
+              <w:jc w:val="center"/>
+            </w:pPr>
+            <w:r>
+              <w:rPr>
+                <w:rFonts w:ascii="Times New Roman" w:hAnsi="Times New Roman"/>
+                <w:b/>
+                <w:sz w:val="21"/>
+              </w:rPr>
+              <w:t>6</w:t>
+            </w:r>
+          </w:p>
+        </w:tc>
+        <w:tc>
+          <w:tcPr>
+            <w:tcW w:type="dxa" w:w="3168"/>
+            <w:shd w:fill="F2F5F8"/>
+          </w:tcPr>
+          <w:p>
+            <w:pPr>
+              <w:spacing w:before="60" w:after="60"/>
+            </w:pPr>
+            <w:r>
+              <w:rPr>
+                <w:rFonts w:ascii="Times New Roman" w:hAnsi="Times New Roman"/>
+                <w:sz w:val="21"/>
+              </w:rPr>
+              <w:t>Quản lý Thời gian</w:t>
+            </w:r>
+          </w:p>
+        </w:tc>
+        <w:tc>
+          <w:tcPr>
+            <w:tcW w:type="dxa" w:w="1584"/>
+            <w:shd w:fill="F2F5F8"/>
+          </w:tcPr>
+          <w:p>
+            <w:pPr>
+              <w:spacing w:before="60" w:after="60"/>
+              <w:jc w:val="center"/>
+            </w:pPr>
+            <w:r>
+              <w:rPr>
+                <w:rFonts w:ascii="Times New Roman" w:hAnsi="Times New Roman"/>
+                <w:b/>
+                <w:sz w:val="21"/>
+              </w:rPr>
+              <w:t>Khá</w:t>
+            </w:r>
+          </w:p>
+        </w:tc>
+        <w:tc>
+          <w:tcPr>
+            <w:tcW w:type="dxa" w:w="4608"/>
+            <w:shd w:fill="F2F5F8"/>
+          </w:tcPr>
+          <w:p>
+            <w:pPr>
+              <w:spacing w:before="60" w:after="60"/>
+            </w:pPr>
+            <w:r>
+              <w:rPr>
+                <w:rFonts w:ascii="Times New Roman" w:hAnsi="Times New Roman"/>
+                <w:sz w:val="21"/>
+              </w:rPr>
+              <w:t>Hoàn thành 100% mục tiêu của 8 tuần thực tập; tiến độ các mốc chính được kiểm soát tốt.</w:t>
+            </w:r>
+          </w:p>
+        </w:tc>
+      </w:tr>
+      <w:tr>
+        <w:tc>
+          <w:tcPr>
+            <w:tcW w:type="dxa" w:w="576"/>
+            <w:shd w:fill="FFFFFF"/>
+          </w:tcPr>
+          <w:p>
+            <w:pPr>
+              <w:spacing w:before="60" w:after="60"/>
+              <w:jc w:val="center"/>
+            </w:pPr>
+            <w:r>
+              <w:rPr>
+                <w:rFonts w:ascii="Times New Roman" w:hAnsi="Times New Roman"/>
+                <w:b/>
+                <w:sz w:val="21"/>
+              </w:rPr>
+              <w:t>7</w:t>
+            </w:r>
+          </w:p>
+        </w:tc>
+        <w:tc>
+          <w:tcPr>
+            <w:tcW w:type="dxa" w:w="3168"/>
+            <w:shd w:fill="FFFFFF"/>
+          </w:tcPr>
+          <w:p>
+            <w:pPr>
+              <w:spacing w:before="60" w:after="60"/>
+            </w:pPr>
+            <w:r>
+              <w:rPr>
+                <w:rFonts w:ascii="Times New Roman" w:hAnsi="Times New Roman"/>
+                <w:sz w:val="21"/>
+              </w:rPr>
+              <w:t>Tài liệu Kỹ thuật</w:t>
+            </w:r>
+          </w:p>
+        </w:tc>
+        <w:tc>
+          <w:tcPr>
+            <w:tcW w:type="dxa" w:w="1584"/>
+            <w:shd w:fill="FFFFFF"/>
+          </w:tcPr>
+          <w:p>
+            <w:pPr>
+              <w:spacing w:before="60" w:after="60"/>
+              <w:jc w:val="center"/>
+            </w:pPr>
+            <w:r>
+              <w:rPr>
+                <w:rFonts w:ascii="Times New Roman" w:hAnsi="Times New Roman"/>
+                <w:b/>
+                <w:sz w:val="21"/>
+              </w:rPr>
+              <w:t>Tốt</w:t>
+            </w:r>
+          </w:p>
+        </w:tc>
+        <w:tc>
+          <w:tcPr>
+            <w:tcW w:type="dxa" w:w="4608"/>
+            <w:shd w:fill="FFFFFF"/>
+          </w:tcPr>
+          <w:p>
+            <w:pPr>
+              <w:spacing w:before="60" w:after="60"/>
+            </w:pPr>
+            <w:r>
+              <w:rPr>
+                <w:rFonts w:ascii="Times New Roman" w:hAnsi="Times New Roman"/>
+                <w:sz w:val="21"/>
+              </w:rPr>
+              <w:t>Đăng 3 bài blog kỹ thuật học thuật; viết file tài liệu thực hành Workshop `Workshop_AWS_ML_Forecasting.md`.</w:t>
+            </w:r>
+          </w:p>
+        </w:tc>
+      </w:tr>
+      <w:tr>
+        <w:tc>
+          <w:tcPr>
+            <w:tcW w:type="dxa" w:w="576"/>
+            <w:shd w:fill="F2F5F8"/>
+          </w:tcPr>
+          <w:p>
+            <w:pPr>
+              <w:spacing w:before="60" w:after="60"/>
+              <w:jc w:val="center"/>
+            </w:pPr>
+            <w:r>
+              <w:rPr>
+                <w:rFonts w:ascii="Times New Roman" w:hAnsi="Times New Roman"/>
+                <w:b/>
+                <w:sz w:val="21"/>
+              </w:rPr>
+              <w:t>8</w:t>
+            </w:r>
+          </w:p>
+        </w:tc>
+        <w:tc>
+          <w:tcPr>
+            <w:tcW w:type="dxa" w:w="3168"/>
+            <w:shd w:fill="F2F5F8"/>
+          </w:tcPr>
+          <w:p>
+            <w:pPr>
+              <w:spacing w:before="60" w:after="60"/>
+            </w:pPr>
+            <w:r>
+              <w:rPr>
+                <w:rFonts w:ascii="Times New Roman" w:hAnsi="Times New Roman"/>
+                <w:sz w:val="21"/>
+              </w:rPr>
+              <w:t>Chủ động &amp; Sáng kiến</w:t>
+            </w:r>
+          </w:p>
+        </w:tc>
+        <w:tc>
+          <w:tcPr>
+            <w:tcW w:type="dxa" w:w="1584"/>
+            <w:shd w:fill="F2F5F8"/>
+          </w:tcPr>
+          <w:p>
+            <w:pPr>
+              <w:spacing w:before="60" w:after="60"/>
+              <w:jc w:val="center"/>
+            </w:pPr>
+            <w:r>
+              <w:rPr>
+                <w:rFonts w:ascii="Times New Roman" w:hAnsi="Times New Roman"/>
+                <w:b/>
+                <w:sz w:val="21"/>
+              </w:rPr>
+              <w:t>Tốt</w:t>
+            </w:r>
+          </w:p>
+        </w:tc>
+        <w:tc>
+          <w:tcPr>
+            <w:tcW w:type="dxa" w:w="4608"/>
+            <w:shd w:fill="F2F5F8"/>
+          </w:tcPr>
+          <w:p>
+            <w:pPr>
+              <w:spacing w:before="60" w:after="60"/>
+            </w:pPr>
+            <w:r>
+              <w:rPr>
+                <w:rFonts w:ascii="Times New Roman" w:hAnsi="Times New Roman"/>
+                <w:sz w:val="21"/>
+              </w:rPr>
+              <w:t>Chủ động kiểm tra quota sớm; đề xuất kiến trúc Serverless REST API với Lambda + API Gateway.</w:t>
+            </w:r>
+          </w:p>
+        </w:tc>
+      </w:tr>
+    </w:tbl>
+    <w:p>
+      <w:pPr>
+        <w:spacing w:before="0" w:after="200" w:line="300" w:lineRule="auto"/>
+        <w:jc w:val="left"/>
+      </w:pPr>
+    </w:p>
+    <w:p>
+      <w:pPr>
+        <w:spacing w:before="240" w:after="80"/>
+        <w:jc w:val="left"/>
+      </w:pPr>
+      <w:r>
+        <w:rPr>
+          <w:rFonts w:ascii="Times New Roman" w:hAnsi="Times New Roman"/>
+          <w:b/>
+          <w:color w:val="006699"/>
+          <w:sz w:val="27"/>
+        </w:rPr>
+        <w:t>5.2. Đánh giá Tổng quan &amp; Phản hồi Thực tập</w:t>
       </w:r>
     </w:p>
     <w:p>
@@ -2581,7 +3341,7 @@
           <w:i w:val="0"/>
           <w:sz w:val="26"/>
         </w:rPr>
-        <w:t>Môi trường làm việc rất thân thiện và cởi mở. Các thành viên FCAJ luôn sẵn sàng hỗ trợ mỗi khi tôi gặp khó khăn, ngay cả ngoài giờ làm việc. Không gian làm việc ngăn nắp, thoải mái, giúp tôi tập trung tốt hơn. Tuy nhiên, tôi nghĩ sẽ rất tuyệt nếu có thêm các hoạt động giao lưu hoặc team-bonding để thắt chặt mối quan hệ giữa các thành viên.</w:t>
+        <w:t>Môi trường làm việc rất thân thiện và cởi mở. Các thành viên FCAJ luôn sẵn sàng hỗ trợ mỗi khi tôi gặp khó khăn, ngay cả ngoài giờ làm việc. Không gian làm việc ngăn nắp, thoải mái, giúp tôi tập trung tốt hơn.</w:t>
       </w:r>
     </w:p>
     <w:p>
@@ -2611,7 +3371,7 @@
           <w:i w:val="0"/>
           <w:sz w:val="26"/>
         </w:rPr>
-        <w:t>Mentor hướng dẫn rất chi tiết, giải thích rõ ràng khi tôi chưa hiểu và luôn khuyến khích tôi đặt câu hỏi. Đội ngũ Admin hỗ trợ hiệu quả các thủ tục hành chính, cung cấp đầy đủ tài liệu cần thiết và tạo điều kiện thuận lợi nhất để tôi làm việc. Tôi đặc biệt đánh giá cao việc mentor để tôi tự suy nghĩ giải quyết vấn đề trước thay vì đưa ngay đáp án.</w:t>
+        <w:t>Mentor hướng dẫn rất chi tiết, giải thích rõ ràng khi tôi chưa hiểu và luôn khuyến khích tôi đặt câu hỏi. Đội ngũ Admin hỗ trợ hiệu quả các thủ tục hành chính, cung cấp đầy đủ tài liệu cần thiết và tạo điều kiện thuận lợi nhất để tôi làm việc.</w:t>
       </w:r>
     </w:p>
     <w:p>
@@ -2641,7 +3401,7 @@
           <w:i w:val="0"/>
           <w:sz w:val="26"/>
         </w:rPr>
-        <w:t>Các công việc được giao bám sát kiến thức tôi đã học tại trường đại học, đồng thời giới thiệu thêm nhiều mảng công nghệ mới mà tôi chưa từng tiếp xúc. Điều này giúp tôi vừa củng cố nền tảng vừa tích lũy được nhiều kỹ năng thực tế có giá trị cao.</w:t>
+        <w:t>Các công việc được giao bám sát kiến thức tôi đã học tại trường đại học, đồng thời giới thiệu thêm nhiều mảng công nghệ mới giúp tôi vừa củng cố nền tảng vừa tích lũy được nhiều kỹ năng thực tế có giá trị cao.</w:t>
       </w:r>
     </w:p>
     <w:p>
@@ -2671,7 +3431,7 @@
           <w:i w:val="0"/>
           <w:sz w:val="26"/>
         </w:rPr>
-        <w:t>Trong suốt kỳ thực tập, tôi đã học hỏi được nhiều kỹ năng mới như sử dụng công cụ quản lý dự án, kỹ năng làm việc nhóm và giao tiếp chuyên nghiệp trong môi trường doanh nghiệp. Mentor cũng chia sẻ nhiều kinh nghiệm thực tế quý báu giúp tôi định hình rõ ràng hơn cho con đường sự nghiệp tương lai.</w:t>
+        <w:t>Trong suốt 8 tuần thực tập, tôi đã học hỏi được nhiều kỹ năng mới như sử dụng công cụ quản lý dự án, kỹ năng làm việc nhóm và giao tiếp chuyên nghiệp trong môi trường doanh nghiệp.</w:t>
       </w:r>
     </w:p>
     <w:p>
@@ -2701,7 +3461,7 @@
           <w:i w:val="0"/>
           <w:sz w:val="26"/>
         </w:rPr>
-        <w:t>Văn hóa công ty rất tích cực: mọi người tôn trọng lẫn nhau, làm việc nghiêm túc nhưng vẫn giữ không khí vui vẻ. Khi có các dự án gấp, tất cả cùng nhau phối hợp và hỗ trợ lẫn nhau không phân biệt vị trí. Điều này khiến tôi cảm thấy mình thực sự là một phần của tập thể, dù chỉ là sinh viên thực tập.</w:t>
+        <w:t>Văn hóa công ty rất tích cực: mọi người tôn trọng lẫn nhau, làm việc nghiêm túc nhưng vẫn giữ không khí vui vẻ, hỗ trợ lẫn nhau không phân biệt vị trí.</w:t>
       </w:r>
     </w:p>
     <w:p>
@@ -2746,22 +3506,7 @@
           <w:color w:val="006699"/>
           <w:sz w:val="27"/>
         </w:rPr>
-        <w:t>5.2. Câu hỏi Bổ sung (Additional Questions)</w:t>
-      </w:r>
-    </w:p>
-    <w:p>
-      <w:pPr>
-        <w:spacing w:before="0" w:after="80" w:line="300" w:lineRule="auto"/>
-        <w:jc w:val="left"/>
-      </w:pPr>
-      <w:r>
-        <w:rPr>
-          <w:rFonts w:ascii="Times New Roman" w:hAnsi="Times New Roman"/>
-          <w:b/>
-          <w:i w:val="0"/>
-          <w:sz w:val="26"/>
-        </w:rPr>
-        <w:t>• Điều gì làm bạn hài lòng nhất trong kỳ thực tập? (What did you find most satisfying during your internship?)</w:t>
+        <w:t>5.3. Đề xuất &amp; Bài học Kinh nghiệm (Recommendations)</w:t>
       </w:r>
     </w:p>
     <w:p>
@@ -2776,22 +3521,7 @@
           <w:i w:val="0"/>
           <w:sz w:val="26"/>
         </w:rPr>
-        <w:t xml:space="preserve">  =&gt; Điều làm tôi hài lòng nhất là sự hỗ trợ tận tình từ Mentor và cơ hội được trực tiếp giải quyết các bài toán thực tế của doanh nghiệp, giúp kỹ năng giải quyết vấn đề của tôi nâng cao rõ rệt.</w:t>
-      </w:r>
-    </w:p>
-    <w:p>
-      <w:pPr>
-        <w:spacing w:before="0" w:after="80" w:line="300" w:lineRule="auto"/>
-        <w:jc w:val="left"/>
-      </w:pPr>
-      <w:r>
-        <w:rPr>
-          <w:rFonts w:ascii="Times New Roman" w:hAnsi="Times New Roman"/>
-          <w:b/>
-          <w:i w:val="0"/>
-          <w:sz w:val="26"/>
-        </w:rPr>
-        <w:t>• Theo bạn công ty nên cải thiện điều gì cho các khóa thực tập sau? (What do you think the company should improve for future interns?)</w:t>
+        <w:t>• Kiểm tra Service Quotas từ Ngày 1: Luôn kiểm tra quota AWS trước khi viết bất kỳ mã nguồn huấn luyện nào.</w:t>
       </w:r>
     </w:p>
     <w:p>
@@ -2806,22 +3536,7 @@
           <w:i w:val="0"/>
           <w:sz w:val="26"/>
         </w:rPr>
-        <w:t xml:space="preserve">  =&gt; Công ty có thể xem xét tổ chức các hoạt động team-bonding thường xuyên hơn để sinh viên thực tập có cơ hội giao lưu, kết nối sâu hơn với các phòng ban khác.</w:t>
-      </w:r>
-    </w:p>
-    <w:p>
-      <w:pPr>
-        <w:spacing w:before="0" w:after="80" w:line="300" w:lineRule="auto"/>
-        <w:jc w:val="left"/>
-      </w:pPr>
-      <w:r>
-        <w:rPr>
-          <w:rFonts w:ascii="Times New Roman" w:hAnsi="Times New Roman"/>
-          <w:b/>
-          <w:i w:val="0"/>
-          <w:sz w:val="26"/>
-        </w:rPr>
-        <w:t>• Nếu giới thiệu cho bạn bè, bạn có đề xuất họ thực tập tại đây không? Vì sao? (If recommending to a friend, would you suggest they intern here? Why or why not?)</w:t>
+        <w:t>• Sử dụng API boto3 trực tiếp: Tăng tính ổn định cho các luồng công việc phức tạp trên SageMaker.</w:t>
       </w:r>
     </w:p>
     <w:p>
@@ -2836,112 +3551,7 @@
           <w:i w:val="0"/>
           <w:sz w:val="26"/>
         </w:rPr>
-        <w:t xml:space="preserve">  =&gt; Chắc chắn có. FCAJ mang lại môi trường thực tế, chuyên nghiệp với văn hóa cởi mở cùng cơ hội học hỏi vô cùng lớn từ các anh chị đi trước giàu kinh nghiệm.</w:t>
-      </w:r>
-    </w:p>
-    <w:p>
-      <w:pPr>
-        <w:spacing w:before="240" w:after="80"/>
-        <w:jc w:val="left"/>
-      </w:pPr>
-      <w:r>
-        <w:rPr>
-          <w:rFonts w:ascii="Times New Roman" w:hAnsi="Times New Roman"/>
-          <w:b/>
-          <w:color w:val="006699"/>
-          <w:sz w:val="27"/>
-        </w:rPr>
-        <w:t>5.3. Đề xuất &amp; Kỳ vọng (Suggestions &amp; Expectations)</w:t>
-      </w:r>
-    </w:p>
-    <w:p>
-      <w:pPr>
-        <w:spacing w:before="0" w:after="80" w:line="300" w:lineRule="auto"/>
-        <w:jc w:val="left"/>
-      </w:pPr>
-      <w:r>
-        <w:rPr>
-          <w:rFonts w:ascii="Times New Roman" w:hAnsi="Times New Roman"/>
-          <w:b/>
-          <w:i w:val="0"/>
-          <w:sz w:val="26"/>
-        </w:rPr>
-        <w:t>• Bạn có đề xuất gì để cải thiện trải nghiệm thực tập không? (Do you have any suggestions to improve the internship experience?)</w:t>
-      </w:r>
-    </w:p>
-    <w:p>
-      <w:pPr>
-        <w:spacing w:before="0" w:after="80" w:line="300" w:lineRule="auto"/>
-        <w:jc w:val="left"/>
-      </w:pPr>
-      <w:r>
-        <w:rPr>
-          <w:rFonts w:ascii="Times New Roman" w:hAnsi="Times New Roman"/>
-          <w:b w:val="0"/>
-          <w:i w:val="0"/>
-          <w:sz w:val="26"/>
-        </w:rPr>
-        <w:t xml:space="preserve">  =&gt; Tôi đề xuất nhóm có thể xây dựng một trang "Knowledge Base" nội bộ ghi lại các sự cố kỹ thuật thường gặp khi làm dự án thực tế (như giới hạn quota AWS, lỗi phân quyền IAM hay cấu hình môi trường). Điều này sẽ giúp các bạn thực tập sinh khóa sau tra cứu, xử lý nhanh hơn và hòa nhập dễ dàng hơn.</w:t>
-      </w:r>
-    </w:p>
-    <w:p>
-      <w:pPr>
-        <w:spacing w:before="0" w:after="80" w:line="300" w:lineRule="auto"/>
-        <w:jc w:val="left"/>
-      </w:pPr>
-      <w:r>
-        <w:rPr>
-          <w:rFonts w:ascii="Times New Roman" w:hAnsi="Times New Roman"/>
-          <w:b/>
-          <w:i w:val="0"/>
-          <w:sz w:val="26"/>
-        </w:rPr>
-        <w:t>• Bạn có muốn tiếp tục đồng hành cùng chương trình trong tương lai không? (Would you like to continue this program in the future?)</w:t>
-      </w:r>
-    </w:p>
-    <w:p>
-      <w:pPr>
-        <w:spacing w:before="0" w:after="80" w:line="300" w:lineRule="auto"/>
-        <w:jc w:val="left"/>
-      </w:pPr>
-      <w:r>
-        <w:rPr>
-          <w:rFonts w:ascii="Times New Roman" w:hAnsi="Times New Roman"/>
-          <w:b w:val="0"/>
-          <w:i w:val="0"/>
-          <w:sz w:val="26"/>
-        </w:rPr>
-        <w:t xml:space="preserve">  =&gt; Rất muốn. Những kinh nghiệm thực tế tích lũy được tại đây là vô giá, và nếu có cơ hội, tôi rất mong muốn được tiếp tục làm việc cùng team trong các dự án dài hạn của công ty.</w:t>
-      </w:r>
-    </w:p>
-    <w:p>
-      <w:pPr>
-        <w:spacing w:before="0" w:after="80" w:line="300" w:lineRule="auto"/>
-        <w:jc w:val="left"/>
-      </w:pPr>
-      <w:r>
-        <w:rPr>
-          <w:rFonts w:ascii="Times New Roman" w:hAnsi="Times New Roman"/>
-          <w:b/>
-          <w:i w:val="0"/>
-          <w:sz w:val="26"/>
-        </w:rPr>
-        <w:t>• Ý kiến đóng góp khác (Chia sẻ tự do) (Any other comments / free sharing):</w:t>
-      </w:r>
-    </w:p>
-    <w:p>
-      <w:pPr>
-        <w:spacing w:before="0" w:after="80" w:line="300" w:lineRule="auto"/>
-        <w:jc w:val="left"/>
-      </w:pPr>
-      <w:r>
-        <w:rPr>
-          <w:rFonts w:ascii="Times New Roman" w:hAnsi="Times New Roman"/>
-          <w:b w:val="0"/>
-          <w:i w:val="0"/>
-          <w:sz w:val="26"/>
-        </w:rPr>
-        <w:t xml:space="preserve">  =&gt; Tôi đánh giá rất cao các buổi workshop cuối tuần do công ty tổ chức. Kiến thức chuyên sâu được chia sẻ trong các buổi này có chất lượng tuyệt vời và đã hỗ trợ tôi rất nhiều trong việc hoàn thành xuất sắc dự án của mình!</w:t>
+        <w:t>• Xây dựng Knowledge Base nội bộ: Đề xuất công ty xây dựng kho kiến thức lưu trữ cách xử lý các sự cố tài nguyên đám mây thường gặp để giúp thực tập sinh khóa sau hòa nhập nhanh chóng hơn.</w:t>
       </w:r>
     </w:p>
     <w:p>

</xml_diff>

<commit_message>
docs: remove sections 3 and 4 in Feedback, enrich technical worklog details for weeks 3, 4, 5
</commit_message>
<xml_diff>
--- a/BaoCao_ThucTap_NgoaiTruong_AWS_SageMaker_MLOps.docx
+++ b/BaoCao_ThucTap_NgoaiTruong_AWS_SageMaker_MLOps.docx
@@ -640,7 +640,7 @@
           <w:rFonts w:ascii="Times New Roman" w:hAnsi="Times New Roman"/>
           <w:sz w:val="24"/>
         </w:rPr>
-        <w:t xml:space="preserve">  2.2. Chi tiết kết quả thực hiện các giai đoạn</w:t>
+        <w:t xml:space="preserve">  2.2. Chi tiết thực hiện các Tuần 3, 4, 5 chuyên sâu</w:t>
       </w:r>
     </w:p>
     <w:p>
@@ -778,7 +778,7 @@
           <w:rFonts w:ascii="Times New Roman" w:hAnsi="Times New Roman"/>
           <w:sz w:val="24"/>
         </w:rPr>
-        <w:t xml:space="preserve">  5.2. Đánh giá Tổng quan &amp; Phản hồi Thực tập</w:t>
+        <w:t xml:space="preserve">  5.2. Đánh giá Tổng quan &amp; Mức độ Hài lòng</w:t>
       </w:r>
     </w:p>
     <w:p>
@@ -790,7 +790,7 @@
           <w:rFonts w:ascii="Times New Roman" w:hAnsi="Times New Roman"/>
           <w:sz w:val="24"/>
         </w:rPr>
-        <w:t xml:space="preserve">  5.3. Đề xuất &amp; Bài học Kinh nghiệm</w:t>
+        <w:t xml:space="preserve">  5.3. Kỹ năng Chuyên môn Áp dụng vào Sự nghiệp</w:t>
       </w:r>
     </w:p>
     <w:p>
@@ -1320,7 +1320,7 @@
                 <w:rFonts w:ascii="Times New Roman" w:hAnsi="Times New Roman"/>
                 <w:sz w:val="22"/>
               </w:rPr>
-              <w:t>Huấn luyện Mô hình XGBoost Baseline</w:t>
+              <w:t>Huấn luyện XGBoost &amp; Optuna Tuning</w:t>
             </w:r>
           </w:p>
         </w:tc>
@@ -1338,7 +1338,7 @@
                 <w:rFonts w:ascii="Times New Roman" w:hAnsi="Times New Roman"/>
                 <w:sz w:val="22"/>
               </w:rPr>
-              <w:t>Xây dựng kịch bản huấn luyện XGBoost Regressor (v1.7.6); Tối ưu siêu tham số bằng Optuna; Phân tích lỗi theo RMSE và MAPE.</w:t>
+              <w:t>Xây dựng kịch bản huấn luyện XGBoost Regressor (v1.7.6); Tối ưu siêu tham số bằng Optuna (max_depth=10, eta=0.03); Phân chia tập dữ liệu theo thời gian.</w:t>
             </w:r>
           </w:p>
         </w:tc>
@@ -1356,7 +1356,7 @@
                 <w:rFonts w:ascii="Times New Roman" w:hAnsi="Times New Roman"/>
                 <w:sz w:val="22"/>
               </w:rPr>
-              <w:t>Mô hình XGBoost đạt kết quả vượt trội: Test RMSE = 925.28, Test MAPE = 9.92%.</w:t>
+              <w:t>Mô hình XGBoost đạt kết quả xuất sắc: Test RMSE = 925.28, Test MAPE = 9.92%.</w:t>
             </w:r>
           </w:p>
         </w:tc>
@@ -1395,7 +1395,7 @@
                 <w:rFonts w:ascii="Times New Roman" w:hAnsi="Times New Roman"/>
                 <w:sz w:val="22"/>
               </w:rPr>
-              <w:t>Thử nghiệm PyTorch LSTM &amp; So sánh</w:t>
+              <w:t>PyTorch LSTM &amp; So sánh Đối chứng</w:t>
             </w:r>
           </w:p>
         </w:tc>
@@ -1431,7 +1431,7 @@
                 <w:rFonts w:ascii="Times New Roman" w:hAnsi="Times New Roman"/>
                 <w:sz w:val="22"/>
               </w:rPr>
-              <w:t>XGBoost áp đảo LSTM (MAPE 9.92% vs 32.79%); Quyết định lựa chọn XGBoost làm Production Model.</w:t>
+              <w:t>XGBoost áp đảo LSTM (MAPE 9.92% vs 32.79%); Phân tích nguyên nhân và chọn XGBoost làm Production Model.</w:t>
             </w:r>
           </w:p>
         </w:tc>
@@ -1470,7 +1470,7 @@
                 <w:rFonts w:ascii="Times New Roman" w:hAnsi="Times New Roman"/>
                 <w:sz w:val="22"/>
               </w:rPr>
-              <w:t>SageMaker Experiments &amp; SHAP Analysis</w:t>
+              <w:t>Model Registry &amp; SHAP Analysis</w:t>
             </w:r>
           </w:p>
         </w:tc>
@@ -1488,7 +1488,7 @@
                 <w:rFonts w:ascii="Times New Roman" w:hAnsi="Times New Roman"/>
                 <w:sz w:val="22"/>
               </w:rPr>
-              <w:t>Tích hợp thư viện `boto3` để ghi nhận siêu tham số và chỉ số đánh giá lên Amazon SageMaker Experiments; Trực quan hóa SHAP Values.</w:t>
+              <w:t>Thiết kế kiến trúc S3 Metadata Registry (v1.0 JSON); Phân tích độ quan trọng đặc trưng bằng SHAP TreeExplainer; Viết kịch bản `inference.py`.</w:t>
             </w:r>
           </w:p>
         </w:tc>
@@ -1506,7 +1506,7 @@
                 <w:rFonts w:ascii="Times New Roman" w:hAnsi="Times New Roman"/>
                 <w:sz w:val="22"/>
               </w:rPr>
-              <w:t>Hoàn thành bài viết Blog 2 về SageMaker Experiments (Tác giả: Nguyễn Ngọc Sáng); Xác định Top 5 đặc trưng quan trọng.</w:t>
+              <w:t>Xác định Top 5 đặc trưng quan trọng (rolling_mean_14, Promo); Hoàn thành `inference.py` cho container.</w:t>
             </w:r>
           </w:p>
         </w:tc>
@@ -1742,6 +1742,111 @@
         <w:spacing w:before="0" w:after="240" w:line="300" w:lineRule="auto"/>
         <w:jc w:val="left"/>
       </w:pPr>
+    </w:p>
+    <w:p>
+      <w:pPr>
+        <w:spacing w:before="240" w:after="80"/>
+        <w:jc w:val="left"/>
+      </w:pPr>
+      <w:r>
+        <w:rPr>
+          <w:rFonts w:ascii="Times New Roman" w:hAnsi="Times New Roman"/>
+          <w:b/>
+          <w:color w:val="006699"/>
+          <w:sz w:val="27"/>
+        </w:rPr>
+        <w:t>2.2. Chi tiết thực hiện các Tuần 3, 4, 5 chuyên sâu</w:t>
+      </w:r>
+    </w:p>
+    <w:p>
+      <w:pPr>
+        <w:spacing w:before="160" w:after="40"/>
+        <w:jc w:val="left"/>
+      </w:pPr>
+      <w:r>
+        <w:rPr>
+          <w:rFonts w:ascii="Times New Roman" w:hAnsi="Times New Roman"/>
+          <w:b/>
+          <w:color w:val="333333"/>
+          <w:sz w:val="26"/>
+        </w:rPr>
+        <w:t>Tuần 3 — Huấn luyện XGBoost &amp; Optuna Hyperparameter Tuning</w:t>
+      </w:r>
+    </w:p>
+    <w:p>
+      <w:pPr>
+        <w:spacing w:before="0" w:after="80" w:line="300" w:lineRule="auto"/>
+        <w:jc w:val="left"/>
+      </w:pPr>
+      <w:r>
+        <w:rPr>
+          <w:rFonts w:ascii="Times New Roman" w:hAnsi="Times New Roman"/>
+          <w:b w:val="0"/>
+          <w:i w:val="0"/>
+          <w:sz w:val="26"/>
+        </w:rPr>
+        <w:t>Trong Tuần 3, nhóm tập trung xây dựng mô hình XGBoost Regressor (v1.7.6) làm mô hình baseline. Nhóm áp dụng phương pháp phân chia dữ liệu nghiêm ngặt theo thời gian (Train: 2013-01 đến 2015-05, Val: 2015-06, Test: 2015-07) để tránh rò rỉ dữ liệu. Sử dụng Optuna để tìm siêu tham số tối ưu (max_depth=10, eta=0.03, subsample=0.8), kết quả thu được cực kỳ ấn tượng trên tập Test độc lập: RMSE = 925.28 và MAPE = 9.92%, vượt xa mục tiêu RMSE ~1,200 ban đầu.</w:t>
+      </w:r>
+    </w:p>
+    <w:p>
+      <w:pPr>
+        <w:spacing w:before="160" w:after="40"/>
+        <w:jc w:val="left"/>
+      </w:pPr>
+      <w:r>
+        <w:rPr>
+          <w:rFonts w:ascii="Times New Roman" w:hAnsi="Times New Roman"/>
+          <w:b/>
+          <w:color w:val="333333"/>
+          <w:sz w:val="26"/>
+        </w:rPr>
+        <w:t>Tuần 4 — Thử nghiệm Deep Learning PyTorch LSTM &amp; So sánh Đối chứng</w:t>
+      </w:r>
+    </w:p>
+    <w:p>
+      <w:pPr>
+        <w:spacing w:before="0" w:after="80" w:line="300" w:lineRule="auto"/>
+        <w:jc w:val="left"/>
+      </w:pPr>
+      <w:r>
+        <w:rPr>
+          <w:rFonts w:ascii="Times New Roman" w:hAnsi="Times New Roman"/>
+          <w:b w:val="0"/>
+          <w:i w:val="0"/>
+          <w:sz w:val="26"/>
+        </w:rPr>
+        <w:t>Trong Tuần 4, nhóm xây dựng mô hình Deep Learning PyTorch LSTM (2 lớp stacked LSTM, hidden_dim=128, dropout=0.2) kết hợp với kỹ thuật chuẩn hóa MinMaxScaler và tạo chuỗi cửa sổ trượt 30 ngày. Kết quả thử nghiệm trên tập Test cho thấy LSTM đạt RMSE 3,044.43 và MAPE 32.79%. Phân tích nguyên nhân cho thấy dữ liệu dạng bảng có tính rời rạc cao và biến động chu kỳ thích hợp hơn với cây quyết định gradient boosting. Nhóm quyết định lựa chọn XGBoost làm mô hình sản xuất chính thức.</w:t>
+      </w:r>
+    </w:p>
+    <w:p>
+      <w:pPr>
+        <w:spacing w:before="160" w:after="40"/>
+        <w:jc w:val="left"/>
+      </w:pPr>
+      <w:r>
+        <w:rPr>
+          <w:rFonts w:ascii="Times New Roman" w:hAnsi="Times New Roman"/>
+          <w:b/>
+          <w:color w:val="333333"/>
+          <w:sz w:val="26"/>
+        </w:rPr>
+        <w:t>Tuần 5 — S3 Model Registry Metadata &amp; SHAP Feature Importance</w:t>
+      </w:r>
+    </w:p>
+    <w:p>
+      <w:pPr>
+        <w:spacing w:before="0" w:after="80" w:line="300" w:lineRule="auto"/>
+        <w:jc w:val="left"/>
+      </w:pPr>
+      <w:r>
+        <w:rPr>
+          <w:rFonts w:ascii="Times New Roman" w:hAnsi="Times New Roman"/>
+          <w:b w:val="0"/>
+          <w:i w:val="0"/>
+          <w:sz w:val="26"/>
+        </w:rPr>
+        <w:t>Trong Tuần 5, do giới hạn SageMaker Model Registry quota = 0, nhóm đã thiết kế kiến trúc S3 Metadata Registry sử dụng định dạng JSON (phiên bản v1.0) lưu vết toàn bộ siêu tham số và chỉ số đánh giá. Nhóm cũng thực thi thuật toán SHAP TreeExplainer để phân tích tầm quan trọng của các đặc trưng, qua đó xác định 2 yếu tố ảnh hưởng lớn nhất đến doanh số là Chương trình khuyến mại (Promo) và Trung bình trượt 14 ngày (rolling_mean_14). Đồng thời hoàn thành kịch bản `inference.py` phục vụ container.</w:t>
+      </w:r>
     </w:p>
     <w:p>
       <w:pPr>
@@ -3311,7 +3416,7 @@
           <w:color w:val="006699"/>
           <w:sz w:val="27"/>
         </w:rPr>
-        <w:t>5.2. Đánh giá Tổng quan &amp; Phản hồi Thực tập</w:t>
+        <w:t>5.2. Đánh giá Tổng quan &amp; Mức độ Hài lòng</w:t>
       </w:r>
     </w:p>
     <w:p>
@@ -3436,17 +3541,17 @@
     </w:p>
     <w:p>
       <w:pPr>
-        <w:spacing w:before="160" w:after="40"/>
+        <w:spacing w:before="240" w:after="80"/>
         <w:jc w:val="left"/>
       </w:pPr>
       <w:r>
         <w:rPr>
           <w:rFonts w:ascii="Times New Roman" w:hAnsi="Times New Roman"/>
           <w:b/>
-          <w:color w:val="333333"/>
-          <w:sz w:val="26"/>
+          <w:color w:val="006699"/>
+          <w:sz w:val="27"/>
         </w:rPr>
-        <w:t>5. Văn hóa Công ty &amp; Tinh thần Đồng đội (Company Culture &amp; Team Spirit)</w:t>
+        <w:t>5.3. Kỹ năng Chuyên môn Áp dụng vào Sự nghiệp</w:t>
       </w:r>
     </w:p>
     <w:p>
@@ -3461,22 +3566,7 @@
           <w:i w:val="0"/>
           <w:sz w:val="26"/>
         </w:rPr>
-        <w:t>Văn hóa công ty rất tích cực: mọi người tôn trọng lẫn nhau, làm việc nghiêm túc nhưng vẫn giữ không khí vui vẻ, hỗ trợ lẫn nhau không phân biệt vị trí.</w:t>
-      </w:r>
-    </w:p>
-    <w:p>
-      <w:pPr>
-        <w:spacing w:before="160" w:after="40"/>
-        <w:jc w:val="left"/>
-      </w:pPr>
-      <w:r>
-        <w:rPr>
-          <w:rFonts w:ascii="Times New Roman" w:hAnsi="Times New Roman"/>
-          <w:b/>
-          <w:color w:val="333333"/>
-          <w:sz w:val="26"/>
-        </w:rPr>
-        <w:t>6. Chính sách &amp; Quyền lợi Thực tập (Internship Policies / Benefits)</w:t>
+        <w:t>• AWS IAM Least Privilege: Thiết kế phân quyền an toàn cho mọi hệ thống đám mây doanh nghiệp.</w:t>
       </w:r>
     </w:p>
     <w:p>
@@ -3491,22 +3581,7 @@
           <w:i w:val="0"/>
           <w:sz w:val="26"/>
         </w:rPr>
-        <w:t>Công ty cung cấp phụ cấp thực tập và hỗ trợ thời gian làm việc linh hoạt khi cần thiết. Ngoài ra, cơ hội tham gia các buổi đào tạo nội bộ chuyên sâu là một điểm cộng rất lớn của chương trình.</w:t>
-      </w:r>
-    </w:p>
-    <w:p>
-      <w:pPr>
-        <w:spacing w:before="240" w:after="80"/>
-        <w:jc w:val="left"/>
-      </w:pPr>
-      <w:r>
-        <w:rPr>
-          <w:rFonts w:ascii="Times New Roman" w:hAnsi="Times New Roman"/>
-          <w:b/>
-          <w:color w:val="006699"/>
-          <w:sz w:val="27"/>
-        </w:rPr>
-        <w:t>5.3. Đề xuất &amp; Bài học Kinh nghiệm (Recommendations)</w:t>
+        <w:t>• Thư viện Python boto3 API: Tự động hóa hạ tầng đám mây và quy trình xử lý dữ liệu tự động.</w:t>
       </w:r>
     </w:p>
     <w:p>
@@ -3521,7 +3596,7 @@
           <w:i w:val="0"/>
           <w:sz w:val="26"/>
         </w:rPr>
-        <w:t>• Kiểm tra Service Quotas từ Ngày 1: Luôn kiểm tra quota AWS trước khi viết bất kỳ mã nguồn huấn luyện nào.</w:t>
+        <w:t>• XGBoost &amp; Feature Engineering: Giải quyết các bài toán Machine Learning dạng bảng và chuỗi thời gian.</w:t>
       </w:r>
     </w:p>
     <w:p>
@@ -3536,7 +3611,7 @@
           <w:i w:val="0"/>
           <w:sz w:val="26"/>
         </w:rPr>
-        <w:t>• Sử dụng API boto3 trực tiếp: Tăng tính ổn định cho các luồng công việc phức tạp trên SageMaker.</w:t>
+        <w:t>• Deploy SageMaker Endpoints: Triển khai mô hình AI/ML phục vụ ứng dụng sản xuất (Production).</w:t>
       </w:r>
     </w:p>
     <w:p>
@@ -3551,7 +3626,7 @@
           <w:i w:val="0"/>
           <w:sz w:val="26"/>
         </w:rPr>
-        <w:t>• Xây dựng Knowledge Base nội bộ: Đề xuất công ty xây dựng kho kiến thức lưu trữ cách xử lý các sự cố tài nguyên đám mây thường gặp để giúp thực tập sinh khóa sau hòa nhập nhanh chóng hơn.</w:t>
+        <w:t>• CloudWatch Monitoring &amp; Drift: Xây dựng hệ thống giám sát sức khỏe mô hình và phát hiện trôi dữ liệu.</w:t>
       </w:r>
     </w:p>
     <w:p>

</xml_diff>